<commit_message>
Start with portfolio neuomorphism ui design
</commit_message>
<xml_diff>
--- a/docs/products.docx
+++ b/docs/products.docx
@@ -20,35 +20,7 @@
           <w:highlight w:val="yellow"/>
           <w:lang w:val="en-US"/>
         </w:rPr>
-        <w:t>trainable</w:t>
-      </w:r>
-      <w:r>
-        <w:rPr>
-          <w:highlight w:val="yellow"/>
-          <w:lang w:val="en-US"/>
-        </w:rPr>
-        <w:t>-</w:t>
-      </w:r>
-      <w:r>
-        <w:rPr>
-          <w:highlight w:val="yellow"/>
-          <w:lang w:val="en-US"/>
-        </w:rPr>
-        <w:t>file</w:t>
-      </w:r>
-      <w:r>
-        <w:rPr>
-          <w:highlight w:val="yellow"/>
-          <w:lang w:val="en-US"/>
-        </w:rPr>
-        <w:t>-</w:t>
-      </w:r>
-      <w:r>
-        <w:rPr>
-          <w:highlight w:val="yellow"/>
-          <w:lang w:val="en-US"/>
-        </w:rPr>
-        <w:t>handler</w:t>
+        <w:t>smart</w:t>
       </w:r>
       <w:r>
         <w:rPr>

</xml_diff>